<commit_message>
feat: adicionar correcao hibrida a prova de TIC
</commit_message>
<xml_diff>
--- a/sistema/INTRODUCAO_A_TECNOLOGIA_DA_INFORMACAO_E_COMUNICACAO/AVALIACOES_CRIADAS/PROVA_SIMPLES_UC1_TIC_DUPLAS_2H.docx
+++ b/sistema/INTRODUCAO_A_TECNOLOGIA_DA_INFORMACAO_E_COMUNICACAO/AVALIACOES_CRIADAS/PROVA_SIMPLES_UC1_TIC_DUPLAS_2H.docx
@@ -771,7 +771,23 @@
           <w:color w:val="1F2937"/>
           <w:sz w:val="21"/>
         </w:rPr>
-        <w:t>Criem uma pasta com o nome DUPLA_NOME1_NOME2 e salvem nela todos os arquivos.</w:t>
+        <w:t>Produzam os três arquivos nos formatos nativos Google Docs, Google Sheets e Google Slides.</w:t>
+      </w:r>
+    </w:p>
+    <w:p>
+      <w:pPr>
+        <w:pStyle w:val="ListBullet"/>
+        <w:spacing w:after="60" w:line="259" w:lineRule="auto"/>
+        <w:ind w:left="547" w:hanging="274"/>
+      </w:pPr>
+      <w:r>
+        <w:rPr>
+          <w:rFonts w:ascii="Calibri" w:hAnsi="Calibri"/>
+          <w:b w:val="0"/>
+          <w:color w:val="1F2937"/>
+          <w:sz w:val="21"/>
+        </w:rPr>
+        <w:t>Criem uma pasta com o nome DUPLA_NOME1_NOME2 e salvem nela os três arquivos.</w:t>
       </w:r>
     </w:p>
     <w:p>
@@ -804,6 +820,38 @@
           <w:sz w:val="21"/>
         </w:rPr>
         <w:t>Toda informação pesquisada deve ter o nome do site ou o link registrado no documento.</w:t>
+      </w:r>
+    </w:p>
+    <w:p>
+      <w:pPr>
+        <w:pStyle w:val="ListBullet"/>
+        <w:spacing w:after="60" w:line="259" w:lineRule="auto"/>
+        <w:ind w:left="547" w:hanging="274"/>
+      </w:pPr>
+      <w:r>
+        <w:rPr>
+          <w:rFonts w:ascii="Calibri" w:hAnsi="Calibri"/>
+          <w:b w:val="0"/>
+          <w:color w:val="1F2937"/>
+          <w:sz w:val="21"/>
+        </w:rPr>
+        <w:t>Compartilhem os três arquivos com o docente; sem acesso, o corretor não conseguirá avaliá-los.</w:t>
+      </w:r>
+    </w:p>
+    <w:p>
+      <w:pPr>
+        <w:pStyle w:val="ListBullet"/>
+        <w:spacing w:after="60" w:line="259" w:lineRule="auto"/>
+        <w:ind w:left="547" w:hanging="274"/>
+      </w:pPr>
+      <w:r>
+        <w:rPr>
+          <w:rFonts w:ascii="Calibri" w:hAnsi="Calibri"/>
+          <w:b w:val="0"/>
+          <w:color w:val="1F2937"/>
+          <w:sz w:val="21"/>
+        </w:rPr>
+        <w:t>Ao final, enviem os três links no Formulário de Entrega fornecido pelo docente.</w:t>
       </w:r>
     </w:p>
     <w:p>
@@ -979,7 +1027,7 @@
           <w:color w:val="1F2937"/>
           <w:sz w:val="21"/>
         </w:rPr>
-        <w:t>Nome sugerido do arquivo:</w:t>
+        <w:t>Nome obrigatório do arquivo:</w:t>
       </w:r>
       <w:r>
         <w:rPr>
@@ -988,7 +1036,7 @@
           <w:color w:val="1F2937"/>
           <w:sz w:val="21"/>
         </w:rPr>
-        <w:t xml:space="preserve"> GUIA_DA_DUPLA.docx</w:t>
+        <w:t xml:space="preserve"> GUIA_DA_DUPLA (Google Docs)</w:t>
       </w:r>
     </w:p>
     <w:p>
@@ -1370,7 +1418,7 @@
           <w:color w:val="1F2937"/>
           <w:sz w:val="21"/>
         </w:rPr>
-        <w:t>A planilha também deve ter: um título, cabeçalhos destacados, filtro nos cabeçalhos e uma fórmula que calcule o total de itens cadastrados.</w:t>
+        <w:t>Use a linha 1 para os cabeçalhos e as linhas 2 a 7 para os seis primeiros registros. Em G2, escreva TOTAL DE ITENS. Em H2, insira uma fórmula que some as quantidades da coluna D. Aplique filtro na linha 1 e destaque os cabeçalhos com uma cor de fundo.</w:t>
       </w:r>
     </w:p>
     <w:p>
@@ -1384,7 +1432,7 @@
           <w:color w:val="1F2937"/>
           <w:sz w:val="21"/>
         </w:rPr>
-        <w:t>Nome sugerido do arquivo:</w:t>
+        <w:t>Nome obrigatório do arquivo:</w:t>
       </w:r>
       <w:r>
         <w:rPr>
@@ -1393,7 +1441,7 @@
           <w:color w:val="1F2937"/>
           <w:sz w:val="21"/>
         </w:rPr>
-        <w:t xml:space="preserve"> INVENTARIO_DA_DUPLA.xlsx</w:t>
+        <w:t xml:space="preserve"> INVENTARIO_DA_DUPLA (Google Sheets)</w:t>
       </w:r>
     </w:p>
     <w:p>
@@ -1514,7 +1562,7 @@
           <w:color w:val="1F2937"/>
           <w:sz w:val="21"/>
         </w:rPr>
-        <w:t>Nome sugerido do arquivo:</w:t>
+        <w:t>Nome obrigatório do arquivo:</w:t>
       </w:r>
       <w:r>
         <w:rPr>
@@ -1523,7 +1571,7 @@
           <w:color w:val="1F2937"/>
           <w:sz w:val="21"/>
         </w:rPr>
-        <w:t xml:space="preserve"> APRESENTACAO_DA_DUPLA.pptx</w:t>
+        <w:t xml:space="preserve"> APRESENTACAO_DA_DUPLA (Google Slides)</w:t>
       </w:r>
     </w:p>
     <w:p>
@@ -1694,6 +1742,22 @@
           <w:color w:val="1F2937"/>
           <w:sz w:val="21"/>
         </w:rPr>
+        <w:t>☐ Os arquivos estão nos formatos nativos Google Docs, Google Sheets e Google Slides.</w:t>
+      </w:r>
+    </w:p>
+    <w:p>
+      <w:pPr>
+        <w:pStyle w:val="ListBullet"/>
+        <w:spacing w:after="60" w:line="259" w:lineRule="auto"/>
+        <w:ind w:left="547" w:hanging="274"/>
+      </w:pPr>
+      <w:r>
+        <w:rPr>
+          <w:rFonts w:ascii="Calibri" w:hAnsi="Calibri"/>
+          <w:b w:val="0"/>
+          <w:color w:val="1F2937"/>
+          <w:sz w:val="21"/>
+        </w:rPr>
         <w:t>☐ O guia tem os itens pedidos e registra uma fonte consultada.</w:t>
       </w:r>
     </w:p>
@@ -1710,7 +1774,7 @@
           <w:color w:val="1F2937"/>
           <w:sz w:val="21"/>
         </w:rPr>
-        <w:t>☐ A planilha tem 6 ou mais registros, filtro e fórmula.</w:t>
+        <w:t>☐ A planilha tem 6 ou mais registros, filtro, cabeçalhos na linha 1 e fórmula em H2.</w:t>
       </w:r>
     </w:p>
     <w:p>
@@ -1742,7 +1806,7 @@
           <w:color w:val="1F2937"/>
           <w:sz w:val="21"/>
         </w:rPr>
-        <w:t>☐ Os arquivos abrem e foram compartilhados conforme orientação do docente.</w:t>
+        <w:t>☐ Os três arquivos foram compartilhados com o docente e seus links foram enviados no formulário.</w:t>
       </w:r>
     </w:p>
     <w:p>
@@ -1774,6 +1838,20 @@
           <w:sz w:val="30"/>
         </w:rPr>
         <w:t>Critérios de avaliação — 10 pontos</w:t>
+      </w:r>
+    </w:p>
+    <w:p>
+      <w:pPr>
+        <w:spacing w:after="100" w:line="259" w:lineRule="auto"/>
+      </w:pPr>
+      <w:r>
+        <w:rPr>
+          <w:rFonts w:ascii="Calibri" w:hAnsi="Calibri"/>
+          <w:b w:val="0"/>
+          <w:color w:val="1F2937"/>
+          <w:sz w:val="21"/>
+        </w:rPr>
+        <w:t>A nota é composta por 7,0 pontos de verificação automática e 3,0 pontos de avaliação do docente. A correção automática confirma requisitos objetivos; a qualidade e a correção das explicações continuam sob responsabilidade do professor.</w:t>
       </w:r>
     </w:p>
     <w:tbl>
@@ -1892,7 +1970,7 @@
                 <w:color w:val="1F2937"/>
                 <w:sz w:val="19"/>
               </w:rPr>
-              <w:t>Comunicação profissional</w:t>
+              <w:t>Organização e entrega — automática</w:t>
             </w:r>
           </w:p>
         </w:tc>
@@ -1915,7 +1993,152 @@
                 <w:color w:val="1F2937"/>
                 <w:sz w:val="19"/>
               </w:rPr>
-              <w:t>Texto claro, formal, organizado e adequado ao ambiente de trabalho.</w:t>
+              <w:t>Links acessíveis, arquivos Google nativos, nomes padronizados e identificação da dupla.</w:t>
+            </w:r>
+          </w:p>
+        </w:tc>
+        <w:tc>
+          <w:tcPr>
+            <w:tcW w:type="dxa" w:w="3360"/>
+            <w:shd w:fill="F2F4F7"/>
+            <w:tcMar>
+              <w:top w:w="80" w:type="dxa"/>
+              <w:start w:w="120" w:type="dxa"/>
+              <w:bottom w:w="80" w:type="dxa"/>
+              <w:end w:w="120" w:type="dxa"/>
+            </w:tcMar>
+          </w:tcPr>
+          <w:p>
+            <w:pPr>
+              <w:jc w:val="center"/>
+            </w:pPr>
+            <w:r>
+              <w:rPr>
+                <w:rFonts w:ascii="Calibri" w:hAnsi="Calibri"/>
+                <w:b w:val="0"/>
+                <w:color w:val="1F2937"/>
+                <w:sz w:val="19"/>
+              </w:rPr>
+              <w:t>1,0</w:t>
+            </w:r>
+          </w:p>
+        </w:tc>
+      </w:tr>
+      <w:tr>
+        <w:tc>
+          <w:tcPr>
+            <w:tcW w:type="dxa" w:w="3360"/>
+            <w:tcMar>
+              <w:top w:w="80" w:type="dxa"/>
+              <w:start w:w="120" w:type="dxa"/>
+              <w:bottom w:w="80" w:type="dxa"/>
+              <w:end w:w="120" w:type="dxa"/>
+            </w:tcMar>
+          </w:tcPr>
+          <w:p>
+            <w:r>
+              <w:rPr>
+                <w:rFonts w:ascii="Calibri" w:hAnsi="Calibri"/>
+                <w:b/>
+                <w:color w:val="1F2937"/>
+                <w:sz w:val="19"/>
+              </w:rPr>
+              <w:t>Google Docs — automática</w:t>
+            </w:r>
+          </w:p>
+        </w:tc>
+        <w:tc>
+          <w:tcPr>
+            <w:tcW w:type="dxa" w:w="3360"/>
+            <w:tcMar>
+              <w:top w:w="80" w:type="dxa"/>
+              <w:start w:w="120" w:type="dxa"/>
+              <w:bottom w:w="80" w:type="dxa"/>
+              <w:end w:w="120" w:type="dxa"/>
+            </w:tcMar>
+          </w:tcPr>
+          <w:p>
+            <w:r>
+              <w:rPr>
+                <w:rFonts w:ascii="Calibri" w:hAnsi="Calibri"/>
+                <w:b w:val="0"/>
+                <w:color w:val="1F2937"/>
+                <w:sz w:val="19"/>
+              </w:rPr>
+              <w:t>Estrutura, conteúdos obrigatórios, termos técnicos, práticas de segurança e fonte.</w:t>
+            </w:r>
+          </w:p>
+        </w:tc>
+        <w:tc>
+          <w:tcPr>
+            <w:tcW w:type="dxa" w:w="3360"/>
+            <w:tcMar>
+              <w:top w:w="80" w:type="dxa"/>
+              <w:start w:w="120" w:type="dxa"/>
+              <w:bottom w:w="80" w:type="dxa"/>
+              <w:end w:w="120" w:type="dxa"/>
+            </w:tcMar>
+          </w:tcPr>
+          <w:p>
+            <w:pPr>
+              <w:jc w:val="center"/>
+            </w:pPr>
+            <w:r>
+              <w:rPr>
+                <w:rFonts w:ascii="Calibri" w:hAnsi="Calibri"/>
+                <w:b w:val="0"/>
+                <w:color w:val="1F2937"/>
+                <w:sz w:val="19"/>
+              </w:rPr>
+              <w:t>2,0</w:t>
+            </w:r>
+          </w:p>
+        </w:tc>
+      </w:tr>
+      <w:tr>
+        <w:tc>
+          <w:tcPr>
+            <w:tcW w:type="dxa" w:w="3360"/>
+            <w:shd w:fill="F2F4F7"/>
+            <w:tcMar>
+              <w:top w:w="80" w:type="dxa"/>
+              <w:start w:w="120" w:type="dxa"/>
+              <w:bottom w:w="80" w:type="dxa"/>
+              <w:end w:w="120" w:type="dxa"/>
+            </w:tcMar>
+          </w:tcPr>
+          <w:p>
+            <w:r>
+              <w:rPr>
+                <w:rFonts w:ascii="Calibri" w:hAnsi="Calibri"/>
+                <w:b/>
+                <w:color w:val="1F2937"/>
+                <w:sz w:val="19"/>
+              </w:rPr>
+              <w:t>Google Sheets — automática</w:t>
+            </w:r>
+          </w:p>
+        </w:tc>
+        <w:tc>
+          <w:tcPr>
+            <w:tcW w:type="dxa" w:w="3360"/>
+            <w:shd w:fill="F2F4F7"/>
+            <w:tcMar>
+              <w:top w:w="80" w:type="dxa"/>
+              <w:start w:w="120" w:type="dxa"/>
+              <w:bottom w:w="80" w:type="dxa"/>
+              <w:end w:w="120" w:type="dxa"/>
+            </w:tcMar>
+          </w:tcPr>
+          <w:p>
+            <w:r>
+              <w:rPr>
+                <w:rFonts w:ascii="Calibri" w:hAnsi="Calibri"/>
+                <w:b w:val="0"/>
+                <w:color w:val="1F2937"/>
+                <w:sz w:val="19"/>
+              </w:rPr>
+              <w:t>Cabeçalhos, seis registros, fórmula, filtro e formatação básica.</w:t>
             </w:r>
           </w:p>
         </w:tc>
@@ -1965,7 +2188,7 @@
                 <w:color w:val="1F2937"/>
                 <w:sz w:val="19"/>
               </w:rPr>
-              <w:t>Segurança da informação</w:t>
+              <w:t>Google Slides — automática</w:t>
             </w:r>
           </w:p>
         </w:tc>
@@ -1987,7 +2210,7 @@
                 <w:color w:val="1F2937"/>
                 <w:sz w:val="19"/>
               </w:rPr>
-              <w:t>Reconhece riscos e apresenta medidas corretas de senha, backup e navegação segura.</w:t>
+              <w:t>Quatro slides, identificação, conteúdos, imagem e quantidade adequada de texto.</w:t>
             </w:r>
           </w:p>
         </w:tc>
@@ -2012,7 +2235,7 @@
                 <w:color w:val="1F2937"/>
                 <w:sz w:val="19"/>
               </w:rPr>
-              <w:t>2,0</w:t>
+              <w:t>1,5</w:t>
             </w:r>
           </w:p>
         </w:tc>
@@ -2037,7 +2260,7 @@
                 <w:color w:val="1F2937"/>
                 <w:sz w:val="19"/>
               </w:rPr>
-              <w:t>Interpretação técnica</w:t>
+              <w:t>Segurança e interpretação — automática</w:t>
             </w:r>
           </w:p>
         </w:tc>
@@ -2060,7 +2283,7 @@
                 <w:color w:val="1F2937"/>
                 <w:sz w:val="19"/>
               </w:rPr>
-              <w:t>Compreende o anexo, explica termos técnicos e adapta a linguagem ao público.</w:t>
+              <w:t>Presença dos conceitos mínimos definidos no Anexo I.</w:t>
             </w:r>
           </w:p>
         </w:tc>
@@ -2086,7 +2309,7 @@
                 <w:color w:val="1F2937"/>
                 <w:sz w:val="19"/>
               </w:rPr>
-              <w:t>2,0</w:t>
+              <w:t>0,5</w:t>
             </w:r>
           </w:p>
         </w:tc>
@@ -2110,7 +2333,7 @@
                 <w:color w:val="1F2937"/>
                 <w:sz w:val="19"/>
               </w:rPr>
-              <w:t>Hardware e software</w:t>
+              <w:t>Clareza e linguagem — docente</w:t>
             </w:r>
           </w:p>
         </w:tc>
@@ -2132,7 +2355,7 @@
                 <w:color w:val="1F2937"/>
                 <w:sz w:val="19"/>
               </w:rPr>
-              <w:t>Identifica componentes, funções, programas e organização de arquivos.</w:t>
+              <w:t>Texto claro, formal, organizado e adequado ao ambiente profissional.</w:t>
             </w:r>
           </w:p>
         </w:tc>
@@ -2157,7 +2380,7 @@
                 <w:color w:val="1F2937"/>
                 <w:sz w:val="19"/>
               </w:rPr>
-              <w:t>2,0</w:t>
+              <w:t>1,0</w:t>
             </w:r>
           </w:p>
         </w:tc>
@@ -2182,7 +2405,7 @@
                 <w:color w:val="1F2937"/>
                 <w:sz w:val="19"/>
               </w:rPr>
-              <w:t>Recursos Web e colaboração</w:t>
+              <w:t>Correção técnica — docente</w:t>
             </w:r>
           </w:p>
         </w:tc>
@@ -2205,7 +2428,7 @@
                 <w:color w:val="1F2937"/>
                 <w:sz w:val="19"/>
               </w:rPr>
-              <w:t>Pesquisa/cita fonte, organiza os arquivos, compartilha corretamente e coopera em dupla.</w:t>
+              <w:t>Explicações corretas, coerentes e adaptadas ao público.</w:t>
             </w:r>
           </w:p>
         </w:tc>
@@ -2231,7 +2454,78 @@
                 <w:color w:val="1F2937"/>
                 <w:sz w:val="19"/>
               </w:rPr>
-              <w:t>2,0</w:t>
+              <w:t>1,0</w:t>
+            </w:r>
+          </w:p>
+        </w:tc>
+      </w:tr>
+      <w:tr>
+        <w:tc>
+          <w:tcPr>
+            <w:tcW w:type="dxa" w:w="3360"/>
+            <w:tcMar>
+              <w:top w:w="80" w:type="dxa"/>
+              <w:start w:w="120" w:type="dxa"/>
+              <w:bottom w:w="80" w:type="dxa"/>
+              <w:end w:w="120" w:type="dxa"/>
+            </w:tcMar>
+          </w:tcPr>
+          <w:p>
+            <w:r>
+              <w:rPr>
+                <w:rFonts w:ascii="Calibri" w:hAnsi="Calibri"/>
+                <w:b/>
+                <w:color w:val="1F2937"/>
+                <w:sz w:val="19"/>
+              </w:rPr>
+              <w:t>Apresentação e cooperação — docente</w:t>
+            </w:r>
+          </w:p>
+        </w:tc>
+        <w:tc>
+          <w:tcPr>
+            <w:tcW w:type="dxa" w:w="3360"/>
+            <w:tcMar>
+              <w:top w:w="80" w:type="dxa"/>
+              <w:start w:w="120" w:type="dxa"/>
+              <w:bottom w:w="80" w:type="dxa"/>
+              <w:end w:w="120" w:type="dxa"/>
+            </w:tcMar>
+          </w:tcPr>
+          <w:p>
+            <w:r>
+              <w:rPr>
+                <w:rFonts w:ascii="Calibri" w:hAnsi="Calibri"/>
+                <w:b w:val="0"/>
+                <w:color w:val="1F2937"/>
+                <w:sz w:val="19"/>
+              </w:rPr>
+              <w:t>Participação dos dois integrantes, domínio e colaboração.</w:t>
+            </w:r>
+          </w:p>
+        </w:tc>
+        <w:tc>
+          <w:tcPr>
+            <w:tcW w:type="dxa" w:w="3360"/>
+            <w:tcMar>
+              <w:top w:w="80" w:type="dxa"/>
+              <w:start w:w="120" w:type="dxa"/>
+              <w:bottom w:w="80" w:type="dxa"/>
+              <w:end w:w="120" w:type="dxa"/>
+            </w:tcMar>
+          </w:tcPr>
+          <w:p>
+            <w:pPr>
+              <w:jc w:val="center"/>
+            </w:pPr>
+            <w:r>
+              <w:rPr>
+                <w:rFonts w:ascii="Calibri" w:hAnsi="Calibri"/>
+                <w:b w:val="0"/>
+                <w:color w:val="1F2937"/>
+                <w:sz w:val="19"/>
+              </w:rPr>
+              <w:t>1,0</w:t>
             </w:r>
           </w:p>
         </w:tc>

</xml_diff>